<commit_message>
Expand the seminar script into a long selectable manuscript.
All sections are now thicker source material for the speaker to cut down
to about 15 minutes live. Rewrite the burden shelf around restraining the
urge to prepay mortgages, with the 125% rule and rate-lag checks, and drop
the already-familiar inflation-versus-deposit and pay-off-faster angles.
Regenerate the Google Docs docx exports to match.

Co-authored-by: love2u2aya <love2u2aya@users.noreply.github.com>
</commit_message>
<xml_diff>
--- a/★AI関連ファイル/projects/カンニング用_Googleドキュメント用.docx
+++ b/★AI関連ファイル/projects/カンニング用_Googleドキュメント用.docx
@@ -79,7 +79,7 @@
         <w:pStyle w:val="ListBullet"/>
       </w:pPr>
       <w:r>
-        <w:t>負担　高い金利の負債を置いたまま投資を増やさないこと</w:t>
+        <w:t>負担　繰上げ返済のボタンを、今日は押さないこと</w:t>
       </w:r>
     </w:p>
     <w:p>
@@ -127,7 +127,7 @@
         <w:pStyle w:val="ListBullet"/>
       </w:pPr>
       <w:r>
-        <w:t>8–11　負担（代表は払う金利＋物価）</w:t>
+        <w:t>8–11　負担（繰上げを止める。125%と見直し確認）</w:t>
       </w:r>
     </w:p>
     <w:p>
@@ -271,7 +271,7 @@
         <w:pStyle w:val="ListBullet"/>
       </w:pPr>
       <w:r>
-        <w:t>負担の変動ローン（約172字）</w:t>
+        <w:t>負担の125%の数字例</w:t>
       </w:r>
     </w:p>
     <w:p>
@@ -279,7 +279,7 @@
         <w:pStyle w:val="ListBullet"/>
       </w:pPr>
       <w:r>
-        <w:t>「変動ローンは、ニュースの翌日には来ません。」から「決着しません。」まで。</w:t>
+        <w:t>「今の返済が月10万円なら…」の一文だけ落としても棚は持つ。</w:t>
       </w:r>
     </w:p>
     <w:p>
@@ -287,7 +287,7 @@
         <w:pStyle w:val="ListBullet"/>
       </w:pPr>
       <w:r>
-        <w:t>ただし、残債がある人が多い回なら、ここは切らずに 3 を深く切る。</w:t>
+        <w:t>残債・焦るな・見直し確認・今日は返さない、は残す。</w:t>
       </w:r>
     </w:p>
     <w:p>
@@ -295,7 +295,7 @@
         <w:pStyle w:val="ListBullet"/>
       </w:pPr>
       <w:r>
-        <w:t>物価の段落（「もう一つ。金利が付いても」）は残す。負担は代表＋物価で1セット。</w:t>
+        <w:t>残債がある人が少ない回なら、負担パート全体を短くし、頭へ早めに入る。</w:t>
       </w:r>
     </w:p>
     <w:p>
@@ -399,7 +399,7 @@
         <w:pStyle w:val="ListBullet"/>
       </w:pPr>
       <w:r>
-        <w:t>負担の「カードのリボ、カードローン、教育ローン、自動車ローン」。列挙は速くなる。1つずつ置く</w:t>
+        <w:t>負担の「次の見直しはいつか、125%はあるか、月々がいくら増えたら嫌か」。三つは区切って言う</w:t>
       </w:r>
     </w:p>
     <w:p>
@@ -485,7 +485,7 @@
         <w:pStyle w:val="ListBullet"/>
       </w:pPr>
       <w:r>
-        <w:t>「誘われて、縛られて、痛んで、平均で安心する。」</w:t>
+        <w:t>「誘われて、縛られて、繰上げしたくなって、平均で安心する。」</w:t>
       </w:r>
     </w:p>
     <w:p>
@@ -528,7 +528,7 @@
         <w:pStyle w:val="ListBullet"/>
       </w:pPr>
       <w:r>
-        <w:t>負担は事務的に。心配させる声にしない</w:t>
+        <w:t>負担は落ち着いて。繰上げを責める声にしない。「返したくなるのは自然」を先に認める</w:t>
       </w:r>
     </w:p>
     <w:p>

</xml_diff>

<commit_message>
Fix Google Docs export for the long selectable script.
Update section headings in the docx generator so the cheat sheet still
pulls the cut guide and delivery notes after the manuscript rewrite.

Co-authored-by: love2u2aya <love2u2aya@users.noreply.github.com>
</commit_message>
<xml_diff>
--- a/★AI関連ファイル/projects/カンニング用_Googleドキュメント用.docx
+++ b/★AI関連ファイル/projects/カンニング用_Googleドキュメント用.docx
@@ -177,7 +177,7 @@
         <w:pStyle w:val="Heading1"/>
       </w:pPr>
       <w:r>
-        <w:t>時間が押した時の切り方（12分版）</w:t>
+        <w:t>選んで削るときの目安</w:t>
       </w:r>
     </w:p>
     <w:p>
@@ -188,7 +188,7 @@
         <w:rPr>
           <w:sz w:val="26"/>
         </w:rPr>
-        <w:t>原則: 在庫の段落だけを落とす。棚の名前・代表・一手・世代の一句は絶対に残す。</w:t>
+        <w:t>全部読むと15分を超える。本番では選ぶ。</w:t>
       </w:r>
     </w:p>
     <w:p>
@@ -199,103 +199,42 @@
         <w:rPr>
           <w:sz w:val="26"/>
         </w:rPr>
-        <w:t>切る場所は4つ。上から順に落とす。</w:t>
+        <w:t>残すと軸がぶれないもの</w:t>
+        <w:br/>
       </w:r>
-    </w:p>
-    <w:p>
-      <w:pPr>
-        <w:pStyle w:val="ListBullet"/>
-      </w:pPr>
       <w:r>
-        <w:t>勧誘の在庫（約220字）</w:t>
+        <w:rPr>
+          <w:sz w:val="26"/>
+        </w:rPr>
+        <w:t>- 冒頭の「前回は取りにいく話／今日は引っかかり」</w:t>
+        <w:br/>
       </w:r>
-    </w:p>
-    <w:p>
-      <w:pPr>
-        <w:pStyle w:val="ListBullet"/>
-      </w:pPr>
       <w:r>
-        <w:t>「同じ棚に、ほかも入っています。名前だけ置きます。」から、預金金利・貯蓄性保険・子ども孫の3段落まで、まるごと。</w:t>
+        <w:rPr>
+          <w:sz w:val="26"/>
+        </w:rPr>
+        <w:t>- 4つの棚の名前</w:t>
+        <w:br/>
       </w:r>
-    </w:p>
-    <w:p>
-      <w:pPr>
-        <w:pStyle w:val="ListBullet"/>
-      </w:pPr>
       <w:r>
-        <w:t>「明後日も残っています」から、そのまま「この棚の今日の一手は」へ飛ぶ。</w:t>
+        <w:rPr>
+          <w:sz w:val="26"/>
+        </w:rPr>
+        <w:t>- 各棚の「今日の一手」</w:t>
+        <w:br/>
       </w:r>
-    </w:p>
-    <w:p>
-      <w:pPr>
-        <w:pStyle w:val="ListBullet"/>
-      </w:pPr>
       <w:r>
-        <w:t>頭の在庫（約224字）</w:t>
+        <w:rPr>
+          <w:sz w:val="26"/>
+        </w:rPr>
+        <w:t>- 負担の「繰上げしたくなる→今日は止める」（残債がある人がいる回）</w:t>
+        <w:br/>
       </w:r>
-    </w:p>
-    <w:p>
-      <w:pPr>
-        <w:pStyle w:val="ListBullet"/>
-      </w:pPr>
       <w:r>
-        <w:t>「名前だけ、あと3つ。」から、見る回数・飛びつき・名前の勘違いの3段落まで、まるごと。</w:t>
-      </w:r>
-    </w:p>
-    <w:p>
-      <w:pPr>
-        <w:pStyle w:val="ListBullet"/>
-      </w:pPr>
-      <w:r>
-        <w:t>代表（平均）だけで棚を閉じる。</w:t>
-      </w:r>
-    </w:p>
-    <w:p>
-      <w:pPr>
-        <w:pStyle w:val="ListBullet"/>
-      </w:pPr>
-      <w:r>
-        <w:t>縛りの在庫（約186字）</w:t>
-      </w:r>
-    </w:p>
-    <w:p>
-      <w:pPr>
-        <w:pStyle w:val="ListBullet"/>
-      </w:pPr>
-      <w:r>
-        <w:t>「同じ棚に、名前だけ置きます。」から、個人向け国債・古い口座の2段落まで、まるごと。</w:t>
-      </w:r>
-    </w:p>
-    <w:p>
-      <w:pPr>
-        <w:pStyle w:val="ListBullet"/>
-      </w:pPr>
-      <w:r>
-        <w:t>負担の125%の数字例</w:t>
-      </w:r>
-    </w:p>
-    <w:p>
-      <w:pPr>
-        <w:pStyle w:val="ListBullet"/>
-      </w:pPr>
-      <w:r>
-        <w:t>「今の返済が月10万円なら…」の一文だけ落としても棚は持つ。</w:t>
-      </w:r>
-    </w:p>
-    <w:p>
-      <w:pPr>
-        <w:pStyle w:val="ListBullet"/>
-      </w:pPr>
-      <w:r>
-        <w:t>残債・焦るな・見直し確認・今日は返さない、は残す。</w:t>
-      </w:r>
-    </w:p>
-    <w:p>
-      <w:pPr>
-        <w:pStyle w:val="ListBullet"/>
-      </w:pPr>
-      <w:r>
-        <w:t>残債がある人が少ない回なら、負担パート全体を短くし、頭へ早めに入る。</w:t>
+        <w:rPr>
+          <w:sz w:val="26"/>
+        </w:rPr>
+        <w:t>- 締めの「新しい金利商品を増やさない」「48時間」「11月の掃除」</w:t>
       </w:r>
     </w:p>
     <w:p>
@@ -306,14 +245,42 @@
         <w:rPr>
           <w:sz w:val="26"/>
         </w:rPr>
-        <w:t>4つ全部落とすと 約2,860字。毎分240字で、およそ11分50秒。</w:t>
+        <w:t>落としやすいブロック</w:t>
         <w:br/>
       </w:r>
       <w:r>
         <w:rPr>
           <w:sz w:val="26"/>
         </w:rPr>
-        <w:t>2つだけ落とすと 約3,220字で、13分20秒。押し方に応じて選ぶ。</w:t>
+        <w:t>- 勧誘の在庫3つ（預金金利・保険・孫）の詳細</w:t>
+        <w:br/>
+      </w:r>
+      <w:r>
+        <w:rPr>
+          <w:sz w:val="26"/>
+        </w:rPr>
+        <w:t>- 縛りの国債の数字、古い口座の具体例（どちらか一方でも可）</w:t>
+        <w:br/>
+      </w:r>
+      <w:r>
+        <w:rPr>
+          <w:sz w:val="26"/>
+        </w:rPr>
+        <w:t>- 負担の「なぜ急ぐか」「元本が減りにくくなる」補足</w:t>
+        <w:br/>
+      </w:r>
+      <w:r>
+        <w:rPr>
+          <w:sz w:val="26"/>
+        </w:rPr>
+        <w:t>- 頭の在庫3つ（見る回数・飛びつき・名前の勘違い）の詳細</w:t>
+        <w:br/>
+      </w:r>
+      <w:r>
+        <w:rPr>
+          <w:sz w:val="26"/>
+        </w:rPr>
+        <w:t>- 世代対比は、各棚で毎回言わなくてもよい。冒頭と締めだけでも可</w:t>
       </w:r>
     </w:p>
     <w:p>
@@ -324,47 +291,14 @@
         <w:rPr>
           <w:sz w:val="26"/>
         </w:rPr>
-        <w:t>切ってはいけない場所</w:t>
+        <w:t>12分に寄せるなら</w:t>
+        <w:br/>
       </w:r>
-    </w:p>
-    <w:p>
-      <w:pPr>
-        <w:pStyle w:val="ListBullet"/>
-      </w:pPr>
       <w:r>
-        <w:t>冒頭の「前回は取りにいく話／今日は引っかかりの話」</w:t>
-      </w:r>
-    </w:p>
-    <w:p>
-      <w:pPr>
-        <w:pStyle w:val="ListBullet"/>
-      </w:pPr>
-      <w:r>
-        <w:t>4つの棚の名前（勧誘・縛り・負担・頭）</w:t>
-      </w:r>
-    </w:p>
-    <w:p>
-      <w:pPr>
-        <w:pStyle w:val="ListBullet"/>
-      </w:pPr>
-      <w:r>
-        <w:t>各棚の「この棚の今日の一手は、○○しないことです。」4回</w:t>
-      </w:r>
-    </w:p>
-    <w:p>
-      <w:pPr>
-        <w:pStyle w:val="ListBullet"/>
-      </w:pPr>
-      <w:r>
-        <w:t>締めの「新しい金利商品を増やさない」「勧誘を48時間置く」</w:t>
-      </w:r>
-    </w:p>
-    <w:p>
-      <w:pPr>
-        <w:pStyle w:val="ListBullet"/>
-      </w:pPr>
-      <w:r>
-        <w:t>11月のお掃除の予告</w:t>
+        <w:rPr>
+          <w:sz w:val="26"/>
+        </w:rPr>
+        <w:t>在庫を全部落とし、各棚は代表＋一手＋世代一句（または世代は冒頭と締めのみ）。</w:t>
       </w:r>
     </w:p>
     <w:p>
@@ -377,13 +311,10 @@
     </w:p>
     <w:p>
       <w:pPr>
-        <w:jc w:val="left"/>
+        <w:pStyle w:val="ListBullet"/>
       </w:pPr>
       <w:r>
-        <w:rPr>
-          <w:sz w:val="26"/>
-        </w:rPr>
-        <w:t>早口になりやすい場所（意識してゆっくり）</w:t>
+        <w:t>長め原稿なので、読み上げ速度より「どこを今日使うか」を先に決める</w:t>
       </w:r>
     </w:p>
     <w:p>
@@ -391,7 +322,7 @@
         <w:pStyle w:val="ListBullet"/>
       </w:pPr>
       <w:r>
-        <w:t>冒頭の「20代30代にとっての金利は／50代60代にとっての金利は」の2行。ここが今日の眼鏡なので、急ぐと全部ぼやける</w:t>
+        <w:t>勧誘のユーモア（椅子をすすめられる）は残すと場が温まる</w:t>
       </w:r>
     </w:p>
     <w:p>
@@ -399,7 +330,7 @@
         <w:pStyle w:val="ListBullet"/>
       </w:pPr>
       <w:r>
-        <w:t>負担の「次の見直しはいつか、125%はあるか、月々がいくら増えたら嫌か」。三つは区切って言う</w:t>
+        <w:t>負担は責めない。「返したくなるのは自然」を先に認める</w:t>
       </w:r>
     </w:p>
     <w:p>
@@ -407,7 +338,7 @@
         <w:pStyle w:val="ListBullet"/>
       </w:pPr>
       <w:r>
-        <w:t>頭の「名前だけ、あと3つ。」以降。短い段落が続くので、走りやすい。段落ごとに一拍</w:t>
+        <w:t>125%は名前と月10万の例だけでも通じる。深追いしない</w:t>
       </w:r>
     </w:p>
     <w:p>
@@ -415,18 +346,7 @@
         <w:pStyle w:val="ListBullet"/>
       </w:pPr>
       <w:r>
-        <w:t>各棚の在庫の段落。読み上げになりかけたら、それは速すぎる合図</w:t>
-      </w:r>
-    </w:p>
-    <w:p>
-      <w:pPr>
-        <w:jc w:val="left"/>
-      </w:pPr>
-      <w:r>
-        <w:rPr>
-          <w:sz w:val="26"/>
-        </w:rPr>
-        <w:t>間を置く場所（1〜2秒、黙る）</w:t>
+        <w:t>「○○しないことです」の語尾は下げて言い切る</w:t>
       </w:r>
     </w:p>
     <w:p>
@@ -434,144 +354,7 @@
         <w:pStyle w:val="ListBullet"/>
       </w:pPr>
       <w:r>
-        <w:t>「引っかかりは、大きく4つです。」の直後。棚の名前を言う前に一拍</w:t>
-      </w:r>
-    </w:p>
-    <w:p>
-      <w:pPr>
-        <w:pStyle w:val="ListBullet"/>
-      </w:pPr>
-      <w:r>
-        <w:t>「この棚の今日の一手は、○○しないことです。」を言い切ったあと。4回とも、次の棚に入る前に必ず空ける</w:t>
-      </w:r>
-    </w:p>
-    <w:p>
-      <w:pPr>
-        <w:pStyle w:val="ListBullet"/>
-      </w:pPr>
-      <w:r>
-        <w:t>「それは平均の話で、うちの話ではありません。」のあと</w:t>
-      </w:r>
-    </w:p>
-    <w:p>
-      <w:pPr>
-        <w:pStyle w:val="ListBullet"/>
-      </w:pPr>
-      <w:r>
-        <w:t>「利息より先に、引っかかりを疑ってください。」と「以上です。」の間</w:t>
-      </w:r>
-    </w:p>
-    <w:p>
-      <w:pPr>
-        <w:jc w:val="left"/>
-      </w:pPr>
-      <w:r>
-        <w:rPr>
-          <w:sz w:val="26"/>
-        </w:rPr>
-        <w:t>読点で息を切る行（読点を全部使う。つなげない）</w:t>
-      </w:r>
-    </w:p>
-    <w:p>
-      <w:pPr>
-        <w:pStyle w:val="ListBullet"/>
-      </w:pPr>
-      <w:r>
-        <w:t>「口座も、定期も、保険も、国債も、今あるもので止める。」</w:t>
-      </w:r>
-    </w:p>
-    <w:p>
-      <w:pPr>
-        <w:pStyle w:val="ListBullet"/>
-      </w:pPr>
-      <w:r>
-        <w:t>「誘われて、縛られて、繰上げしたくなって、平均で安心する。」</w:t>
-      </w:r>
-    </w:p>
-    <w:p>
-      <w:pPr>
-        <w:pStyle w:val="ListBullet"/>
-      </w:pPr>
-      <w:r>
-        <w:t>「その200万は、定期に入れない。現金のまま残していい。」</w:t>
-      </w:r>
-    </w:p>
-    <w:p>
-      <w:pPr>
-        <w:jc w:val="left"/>
-      </w:pPr>
-      <w:r>
-        <w:rPr>
-          <w:sz w:val="26"/>
-        </w:rPr>
-        <w:t>温度</w:t>
-      </w:r>
-    </w:p>
-    <w:p>
-      <w:pPr>
-        <w:pStyle w:val="ListBullet"/>
-      </w:pPr>
-      <w:r>
-        <w:t>勧誘は少し笑いながら。「今は、椅子をすすめられます。」は軽く落とす</w:t>
-      </w:r>
-    </w:p>
-    <w:p>
-      <w:pPr>
-        <w:pStyle w:val="ListBullet"/>
-      </w:pPr>
-      <w:r>
-        <w:t>縛りは具体に。数字（1年、3年、200万）ははっきり</w:t>
-      </w:r>
-    </w:p>
-    <w:p>
-      <w:pPr>
-        <w:pStyle w:val="ListBullet"/>
-      </w:pPr>
-      <w:r>
-        <w:t>負担は落ち着いて。繰上げを責める声にしない。「返したくなるのは自然」を先に認める</w:t>
-      </w:r>
-    </w:p>
-    <w:p>
-      <w:pPr>
-        <w:pStyle w:val="ListBullet"/>
-      </w:pPr>
-      <w:r>
-        <w:t>頭は少しだけ強く。ただし「皆さんは間違っている」の声にしない</w:t>
-      </w:r>
-    </w:p>
-    <w:p>
-      <w:pPr>
-        <w:jc w:val="left"/>
-      </w:pPr>
-      <w:r>
-        <w:rPr>
-          <w:sz w:val="26"/>
-        </w:rPr>
-        <w:t>共通</w:t>
-      </w:r>
-    </w:p>
-    <w:p>
-      <w:pPr>
-        <w:pStyle w:val="ListBullet"/>
-      </w:pPr>
-      <w:r>
-        <w:t>「○○しないことです」の語尾は、下げて言い切る。上げると相談になる</w:t>
-      </w:r>
-    </w:p>
-    <w:p>
-      <w:pPr>
-        <w:pStyle w:val="ListBullet"/>
-      </w:pPr>
-      <w:r>
-        <w:t>「若い人」を言うとき、声を落とさない。下げる言い方に聞こえる</w:t>
-      </w:r>
-    </w:p>
-    <w:p>
-      <w:pPr>
-        <w:pStyle w:val="ListBullet"/>
-      </w:pPr>
-      <w:r>
-        <w:t>芝居がからない。普段の会話の高さで話す。台本にある体言止め（「見る回数。」「飛びつき。」など）は、名札を置くだけのつもりで軽く読む</w:t>
+        <w:t>「若い人」を言うとき、声を落とさない</w:t>
       </w:r>
     </w:p>
     <w:sectPr>

</xml_diff>